<commit_message>
NAR submission v3.1: final assembly (19 items)
- cover_letter.docx replaced by the v3.1 letter (old-value counters zeroed, 4 recommended reviewers restored, supplementary range now S1-S17)
- Supplementary_Tables.docx (S1-S17, 21 table objects) added
- All_Tables.docx rebuilt from current NAR_MANUSCRIPT_REVISED.md: the previous build predated the exact-permutation fix and still carried 1.73e-6 in Table 1/Table 8; now 1.86e-9 x8, 1.73e-6 x0
- NAR_MANUSCRIPT_REVISED_v3.1.docx (eea91c4) and repro_package_v2.1.zip (820 files) refreshed
- figures unchanged (PDF only)
</commit_message>
<xml_diff>
--- a/NAR_Submission_v3.1/All_Tables.docx
+++ b/NAR_Submission_v3.1/All_Tables.docx
@@ -272,7 +272,7 @@
               <w:pStyle w:val="Compact"/>
             </w:pPr>
             <w:r>
-              <w:t xml:space="preserve">FT2 (p=1.73×10⁻⁶)</w:t>
+              <w:t xml:space="preserve">FT2 (p=1.86×10⁻⁹)</w:t>
             </w:r>
           </w:p>
         </w:tc>
@@ -390,7 +390,7 @@
               <w:pStyle w:val="Compact"/>
             </w:pPr>
             <w:r>
-              <w:t xml:space="preserve">FT2 (p=1.73×10⁻⁶)</w:t>
+              <w:t xml:space="preserve">FT2 (p=1.86×10⁻⁹)</w:t>
             </w:r>
           </w:p>
         </w:tc>
@@ -476,6 +476,44 @@
       </w:r>
       <w:r>
         <w:t xml:space="preserve">. Values are mean ± standard deviation, computed with the root-independent (unrooted) RF definition given in the Methods. Seed counts differ by condition: 130 seeds for n=200 (clean: seeds 100–229; indel: seeds 100–229), 30 seeds for n=500 and n=1000. All nRF values are TRUE-relative (vs the simulated ground-truth tree).</w:t>
+      </w:r>
+      <w:r>
+        <w:t xml:space="preserve"> </w:t>
+      </w:r>
+      <w:r>
+        <w:t xml:space="preserve">‡ The n=500 and n=1000 clean rows carry the</w:t>
+      </w:r>
+      <w:r>
+        <w:t xml:space="preserve"> </w:t>
+      </w:r>
+      <w:r>
+        <w:rPr>
+          <w:i/>
+          <w:iCs/>
+        </w:rPr>
+        <w:t xml:space="preserve">same</w:t>
+      </w:r>
+      <w:r>
+        <w:t xml:space="preserve"> </w:t>
+      </w:r>
+      <w:r>
+        <w:t xml:space="preserve">p-value because the two comparisons are unanimous in the same way: in each, all 30 seeds favour FastTree2 (Fusang better in 0/30, no ties), so the signed-rank statistic sits at its floor (W=0) and, at equal seed count, the two rows share a single exact value. This is a property of a discrete test statistic, not a transcription error. Both rows are reported as</w:t>
+      </w:r>
+      <w:r>
+        <w:t xml:space="preserve"> </w:t>
+      </w:r>
+      <w:r>
+        <w:rPr>
+          <w:b/>
+          <w:bCs/>
+        </w:rPr>
+        <w:t xml:space="preserve">exact sign-flip permutation</w:t>
+      </w:r>
+      <w:r>
+        <w:t xml:space="preserve"> </w:t>
+      </w:r>
+      <w:r>
+        <w:t xml:space="preserve">p-values (2/2³⁰ = 1.86×10⁻⁹) rather than as normal-approximation values: at W=0 the large-sample approximation breaks down in the extreme tail and is conservative here by nearly three orders of magnitude (see the Methods statistical framework). All other p-values in this table come from comparisons whose statistic is away from the floor and are reported under the tie-corrected zero-split normal approximation described in the Methods.</w:t>
       </w:r>
       <w:r>
         <w:t xml:space="preserve"> </w:t>
@@ -785,7 +823,7 @@
         <w:t xml:space="preserve"> </w:t>
       </w:r>
       <w:r>
-        <w:t xml:space="preserve">accurate under indels. Paired Mash − Fusang comparison (positive = Mash worse): clean +0.1122 (Wilcoxon p=1.73×10⁻⁶; sign-flip permutation p=1.86×10⁻⁹; paired Cohen’s d=3.123; Fusang better in 30/30 seeds), indel +0.2108 (p=1.86×10⁻⁹; d=2.615; Fusang better in 30/30 seeds). A 130-seed sensitivity run over the full seed range (seeds 100–229) gives the same picture (Fusang 0.2343 clean / 0.1990 indel; Mash 0.3529 / 0.4075; Fusang better in 130/130 seeds in both conditions), so the conclusion is not driven by seed count. Mash v2.3 (</w:t>
+        <w:t xml:space="preserve">accurate under indels. Paired Mash − Fusang comparison (positive = Mash worse): clean +0.1122 (p=1.86×10⁻⁹; paired Cohen’s d=3.123; Fusang better in 30/30 seeds), indel +0.2108 (p=1.86×10⁻⁹; d=2.615; Fusang better in 30/30 seeds). Both Mash−Fusang comparisons are unanimous (Fusang better in 30/30 seeds, no ties in either condition), so both are reported as exact sign-flip permutation p-values (2/2³⁰ = 1.86×10⁻⁹) rather than as normal-approximation values — the same convention as the two unanimous clean rows of Table 1. A 130-seed sensitivity run over the full seed range (seeds 100–229) gives the same picture (Fusang 0.2343 clean / 0.1990 indel; Mash 0.3529 / 0.4075; Fusang better in 130/130 seeds in both conditions), so the conclusion is not driven by seed count. Mash v2.3 (</w:t>
       </w:r>
       <w:r>
         <w:rPr>
@@ -4483,7 +4521,7 @@
               <w:pStyle w:val="Compact"/>
             </w:pPr>
             <w:r>
-              <w:t xml:space="preserve">FT2 better (clean, p=1.73×10⁻⁶)</w:t>
+              <w:t xml:space="preserve">FT2 better (clean, p=1.86×10⁻⁹)</w:t>
             </w:r>
           </w:p>
         </w:tc>
@@ -4545,7 +4583,7 @@
               <w:pStyle w:val="Compact"/>
             </w:pPr>
             <w:r>
-              <w:t xml:space="preserve">FT2 better (clean, p=1.73×10⁻⁶)</w:t>
+              <w:t xml:space="preserve">FT2 better (clean, p=1.86×10⁻⁹)</w:t>
             </w:r>
           </w:p>
         </w:tc>

</xml_diff>